<commit_message>
La société du cabinet devient « MB AxisPro » ; le métier « Chantiers » devient « BTP »
Décisions du gérant du 21 octobre. Nom de la société dans le code, les écrans, la maquette, les guides
et les documents de projet (l'offre et l'accord de confidentialité signés restent inchangés) ; migration
d'eguitra_base 19.0.1.3.0 qui renomme la société du cabinet dans les bases existantes. Libellés du
profil, du module, du menu et des analyses : « BTP » (un chantier reste un chantier).

Co-Authored-By: Claude Opus 5.5 <noreply@anthropic.com>
</commit_message>
<xml_diff>
--- a/docs/guides/word/Guide_administration.docx
+++ b/docs/guides/word/Guide_administration.docx
@@ -210,7 +210,7 @@
           <w:sz w:val="20"/>
           <w:szCs w:val="20"/>
         </w:rPr>
-        <w:t xml:space="preserve">Deux sociétés, un seul compte : si votre compte est ouvert à EGUITRA GROUP SARLU et à MB AxisPro Consulting, choisissez la société de travail avec le sélecteur en haut de l'écran ; l'écran se recharge sur les données de cette société. Les comptabilités restent séparées. La direction et la finance disposent aussi de la vue « Groupe consolidé » qui réunit les deux.</w:t>
+        <w:t xml:space="preserve">Deux sociétés, un seul compte : si votre compte est ouvert à EGUITRA GROUP SARLU et à MB AxisPro, choisissez la société de travail avec le sélecteur en haut de l'écran ; l'écran se recharge sur les données de cette société. Les comptabilités restent séparées. La direction et la finance disposent aussi de la vue « Groupe consolidé » qui réunit les deux.</w:t>
       </w:r>
     </w:p>
     <w:p>
@@ -331,7 +331,7 @@
           <w:sz w:val="20"/>
           <w:szCs w:val="20"/>
         </w:rPr>
-        <w:t xml:space="preserve">Sociétés accessibles : cocher EGUITRA GROUP SARLU, MB AxisPro Consulting ou les deux, et choisir la société à l'ouverture. Un compte ouvert aux deux passe de l'une à l'autre sans se reconnecter ; chaque comptabilité reste séparée.</w:t>
+        <w:t xml:space="preserve">Sociétés accessibles : cocher EGUITRA GROUP SARLU, MB AxisPro ou les deux, et choisir la société à l'ouverture. Un compte ouvert aux deux passe de l'une à l'autre sans se reconnecter ; chaque comptabilité reste séparée.</w:t>
       </w:r>
     </w:p>
     <w:p>

</xml_diff>

<commit_message>
Guide d'administration : profil achats et libellé BTP
Co-Authored-By: Claude Opus 5.5 <noreply@anthropic.com>
</commit_message>
<xml_diff>
--- a/docs/guides/word/Guide_administration.docx
+++ b/docs/guides/word/Guide_administration.docx
@@ -11,7 +11,7 @@
           <wp:inline distT="0" distB="0" distL="0" distR="0">
             <wp:extent cx="1428750" cy="476250"/>
             <wp:effectExtent t="0" r="0" b="0" l="0"/>
-            <wp:docPr id="1" name="" descr="" title=""/>
+            <wp:docPr id="2" name="" descr="" title=""/>
             <wp:cNvGraphicFramePr>
               <a:graphicFrameLocks xmlns:a="http://schemas.openxmlformats.org/drawingml/2006/main" noChangeAspect="1"/>
             </wp:cNvGraphicFramePr>
@@ -302,7 +302,7 @@
           <w:sz w:val="20"/>
           <w:szCs w:val="20"/>
         </w:rPr>
-        <w:t xml:space="preserve">Profils : direction, finance, exploitation, chantiers, immobilier, cabinet, administration, porteur (ce dernier réservé au portail, ouvert depuis la fiche d'un dossier AxisPro).</w:t>
+        <w:t xml:space="preserve">Profils : direction, finance, achats, exploitation, BTP, immobilier, cabinet, administration, porteur (ce dernier réservé au portail, ouvert depuis la fiche d'un dossier AxisPro). Le profil achats ouvre les engagements de dépense, les pièces d'achat par catégorie, les fournisseurs et le suivi de ses demandes, rien d'autre de la comptabilité.</w:t>
       </w:r>
     </w:p>
     <w:p>

</xml_diff>

<commit_message>
Nom du cabinet : « MB AxisPro Consulting » partout (société, application, écrans, portail, guides), migrations de la société et des articles du portail
Décision du gérant du 22 octobre 2026, qui annule le nom court « MB AxisPro » de la 19.0.1.3.0.
eguitra_base 19.0.1.6.0 renomme la société ; eguitra_portail 19.0.1.1.0 corrige les articles créés
à l'installation. Les identifiants techniques (axispro, /axispro, entité cabinet) ne changent pas.

Co-Authored-By: Claude Opus 5.5 <noreply@anthropic.com>
</commit_message>
<xml_diff>
--- a/docs/guides/word/Guide_administration.docx
+++ b/docs/guides/word/Guide_administration.docx
@@ -210,7 +210,7 @@
           <w:sz w:val="20"/>
           <w:szCs w:val="20"/>
         </w:rPr>
-        <w:t xml:space="preserve">Deux sociétés, un seul compte : si votre compte est ouvert à EGUITRA GROUP SARLU et à MB AxisPro, choisissez la société de travail avec le sélecteur en haut de l'écran ; l'écran se recharge sur les données de cette société. Les comptabilités restent séparées. La direction et la finance disposent aussi de la vue « Groupe consolidé » qui réunit les deux.</w:t>
+        <w:t xml:space="preserve">Deux sociétés, un seul compte : si votre compte est ouvert à EGUITRA GROUP SARLU et à MB AxisPro Consulting, choisissez la société de travail avec le sélecteur en haut de l'écran ; l'écran se recharge sur les données de cette société. Les comptabilités restent séparées. La direction et la finance disposent aussi de la vue « Groupe consolidé » qui réunit les deux.</w:t>
       </w:r>
     </w:p>
     <w:p>
@@ -331,7 +331,7 @@
           <w:sz w:val="20"/>
           <w:szCs w:val="20"/>
         </w:rPr>
-        <w:t xml:space="preserve">Sociétés accessibles : cocher EGUITRA GROUP SARLU, MB AxisPro ou les deux, et choisir la société à l'ouverture. Un compte ouvert aux deux passe de l'une à l'autre sans se reconnecter ; chaque comptabilité reste séparée.</w:t>
+        <w:t xml:space="preserve">Sociétés accessibles : cocher EGUITRA GROUP SARLU, MB AxisPro Consulting ou les deux, et choisir la société à l'ouverture. Un compte ouvert aux deux passe de l'une à l'autre sans se reconnecter ; chaque comptabilité reste séparée.</w:t>
       </w:r>
     </w:p>
     <w:p>

</xml_diff>